<commit_message>
Add ChatGPT row to the AI-use declaration table
Co-Authored-By: Claude Fable 5 <noreply@anthropic.com>
Claude-Session: https://claude.ai/code/session_01UxjctmnUe9fGqd8WLWUStd
</commit_message>
<xml_diff>
--- a/seminar/הצהרת שימוש בבינה מלאכותית - אבו קארם.docx
+++ b/seminar/הצהרת שימוש בבינה מלאכותית - אבו קארם.docx
@@ -393,6 +393,100 @@
           </w:p>
         </w:tc>
       </w:tr>
+      <w:tr>
+        <w:tc>
+          <w:tcPr>
+            <w:tcW w:type="dxa" w:w="2000"/>
+          </w:tcPr>
+          <w:p>
+            <w:pPr>
+              <w:bidi/>
+              <w:spacing w:after="40" w:line="300" w:lineRule="auto"/>
+              <w:jc w:val="right"/>
+            </w:pPr>
+            <w:r>
+              <w:rPr>
+                <w:rFonts w:ascii="Times New Roman" w:cs="Times New Roman" w:hAnsi="Times New Roman"/>
+                <w:b w:val="false"/>
+                <w:bCs w:val="false"/>
+                <w:sz w:val="24"/>
+                <w:szCs w:val="24"/>
+                <w:rtl w:val="false"/>
+              </w:rPr>
+              <w:t xml:space="preserve">ChatGPT (OpenAI)</w:t>
+            </w:r>
+          </w:p>
+        </w:tc>
+        <w:tc>
+          <w:tcPr>
+            <w:tcW w:type="dxa" w:w="2600"/>
+          </w:tcPr>
+          <w:p>
+            <w:pPr>
+              <w:bidi/>
+              <w:spacing w:after="40" w:line="300" w:lineRule="auto"/>
+              <w:jc w:val="right"/>
+            </w:pPr>
+            <w:r>
+              <w:rPr>
+                <w:rFonts w:ascii="David" w:cs="David" w:hAnsi="David"/>
+                <w:b w:val="false"/>
+                <w:bCs w:val="false"/>
+                <w:sz w:val="24"/>
+                <w:szCs w:val="24"/>
+                <w:rtl/>
+              </w:rPr>
+              <w:t xml:space="preserve">[להשלים: באיזה חלק של העבודה נעשה שימוש]</w:t>
+            </w:r>
+          </w:p>
+        </w:tc>
+        <w:tc>
+          <w:tcPr>
+            <w:tcW w:type="dxa" w:w="3000"/>
+          </w:tcPr>
+          <w:p>
+            <w:pPr>
+              <w:bidi/>
+              <w:spacing w:after="40" w:line="300" w:lineRule="auto"/>
+              <w:jc w:val="right"/>
+            </w:pPr>
+            <w:r>
+              <w:rPr>
+                <w:rFonts w:ascii="David" w:cs="David" w:hAnsi="David"/>
+                <w:b w:val="false"/>
+                <w:bCs w:val="false"/>
+                <w:sz w:val="24"/>
+                <w:szCs w:val="24"/>
+                <w:rtl/>
+              </w:rPr>
+              <w:t xml:space="preserve">[להשלים: מטרת השימוש, למשל חיפוש רעיונות, סיכום מאמרים או שיפור ניסוח]</w:t>
+            </w:r>
+          </w:p>
+        </w:tc>
+        <w:tc>
+          <w:tcPr>
+            <w:tcW w:type="dxa" w:w="1472"/>
+          </w:tcPr>
+          <w:p>
+            <w:pPr>
+              <w:bidi/>
+              <w:spacing w:after="40" w:line="300" w:lineRule="auto"/>
+              <w:jc w:val="right"/>
+            </w:pPr>
+            <w:r>
+              <w:rPr>
+                <w:rFonts w:ascii="David" w:cs="David" w:hAnsi="David"/>
+                <w:b w:val="false"/>
+                <w:bCs w:val="false"/>
+                <w:sz w:val="24"/>
+                <w:szCs w:val="24"/>
+                <w:rtl/>
+              </w:rPr>
+              <w:t xml:space="preserve">[להשלים קישור]</w:t>
+            </w:r>
+          </w:p>
+        </w:tc>
+      </w:tr>
     </w:tbl>
     <w:p>
       <w:pPr>

</xml_diff>